<commit_message>
info project BT MS, project draft docx, text muted color, own contribution ->experimental
</commit_message>
<xml_diff>
--- a/Project_Drafts/Project_Draft_Experiment.docx
+++ b/Project_Drafts/Project_Draft_Experiment.docx
@@ -33,7 +33,7 @@
         </w:rPr>
         <w:t xml:space="preserve">Need help completing the template? </w:t>
       </w:r>
-      <w:hyperlink r:id="rId8" w:history="1">
+      <w:hyperlink r:id="rId9" w:history="1">
         <w:r>
           <w:rPr>
             <w:rStyle w:val="Hyperlink"/>
@@ -239,37 +239,27 @@
               <w:t xml:space="preserve">Describe as detailed as possible, how you plan to answer your research question </w:t>
             </w:r>
             <w:r>
-              <w:t xml:space="preserve">(e.g., theoretical model, </w:t>
-            </w:r>
-            <w:r>
-              <w:t>analysis of f</w:t>
-            </w:r>
-            <w:r>
-              <w:t>ield</w:t>
+              <w:t>(</w:t>
+            </w:r>
+            <w:proofErr w:type="spellStart"/>
+            <w:r>
+              <w:t>e.g</w:t>
+            </w:r>
+            <w:proofErr w:type="spellEnd"/>
+            <w:r>
+              <w:t xml:space="preserve"> own collected</w:t>
             </w:r>
             <w:r>
               <w:t xml:space="preserve"> </w:t>
             </w:r>
             <w:r>
-              <w:t>/</w:t>
-            </w:r>
-            <w:r>
-              <w:t xml:space="preserve"> </w:t>
-            </w:r>
-            <w:r>
-              <w:t>register</w:t>
-            </w:r>
-            <w:r>
-              <w:t xml:space="preserve"> </w:t>
-            </w:r>
-            <w:r>
-              <w:t>/</w:t>
-            </w:r>
-            <w:r>
-              <w:t xml:space="preserve"> </w:t>
-            </w:r>
-            <w:r>
-              <w:t>survey data, experiment, literature review, …)</w:t>
+              <w:t xml:space="preserve">survey data, experiment, </w:t>
+            </w:r>
+            <w:r>
+              <w:t>experiment in a survey</w:t>
+            </w:r>
+            <w:r>
+              <w:t>…)</w:t>
             </w:r>
             <w:r>
               <w:t xml:space="preserve">. </w:t>
@@ -1655,21 +1645,6 @@
 </file>
 
 <file path=customXml/item1.xml><?xml version="1.0" encoding="utf-8"?>
-<p:properties xmlns:p="http://schemas.microsoft.com/office/2006/metadata/properties" xmlns:xsi="http://www.w3.org/2001/XMLSchema-instance" xmlns:pc="http://schemas.microsoft.com/office/infopath/2007/PartnerControls">
-  <documentManagement/>
-</p:properties>
-</file>
-
-<file path=customXml/item2.xml><?xml version="1.0" encoding="utf-8"?>
-<?mso-contentType ?>
-<FormTemplates xmlns="http://schemas.microsoft.com/sharepoint/v3/contenttype/forms">
-  <Display>DocumentLibraryForm</Display>
-  <Edit>DocumentLibraryForm</Edit>
-  <New>DocumentLibraryForm</New>
-</FormTemplates>
-</file>
-
-<file path=customXml/item3.xml><?xml version="1.0" encoding="utf-8"?>
 <ct:contentTypeSchema xmlns:ct="http://schemas.microsoft.com/office/2006/metadata/contentType" xmlns:ma="http://schemas.microsoft.com/office/2006/metadata/properties/metaAttributes" ct:_="" ma:_="" ma:contentTypeName="Dokument" ma:contentTypeID="0x01010082BA5C279903894DA777E5C36F860EFD" ma:contentTypeVersion="3" ma:contentTypeDescription="Ein neues Dokument erstellen." ma:contentTypeScope="" ma:versionID="704cd79292e6c0e728fd79ff16b1f141">
   <xsd:schema xmlns:xsd="http://www.w3.org/2001/XMLSchema" xmlns:xs="http://www.w3.org/2001/XMLSchema" xmlns:p="http://schemas.microsoft.com/office/2006/metadata/properties" xmlns:ns2="4938f991-2b30-4e51-84ba-e9c517293fca" targetNamespace="http://schemas.microsoft.com/office/2006/metadata/properties" ma:root="true" ma:fieldsID="bd5b437fe9fd6de4875bc5d7656127da" ns2:_="">
     <xsd:import namespace="4938f991-2b30-4e51-84ba-e9c517293fca"/>
@@ -1807,24 +1782,26 @@
 </ct:contentTypeSchema>
 </file>
 
-<file path=customXml/itemProps1.xml><?xml version="1.0" encoding="utf-8"?>
-<ds:datastoreItem xmlns:ds="http://schemas.openxmlformats.org/officeDocument/2006/customXml" ds:itemID="{2E466FA6-9F10-47D9-BA4E-D0174AD7654D}">
-  <ds:schemaRefs>
-    <ds:schemaRef ds:uri="http://schemas.microsoft.com/office/2006/metadata/properties"/>
-    <ds:schemaRef ds:uri="http://schemas.microsoft.com/office/infopath/2007/PartnerControls"/>
-  </ds:schemaRefs>
-</ds:datastoreItem>
+<file path=customXml/item2.xml><?xml version="1.0" encoding="utf-8"?>
+<?mso-contentType ?>
+<FormTemplates xmlns="http://schemas.microsoft.com/sharepoint/v3/contenttype/forms">
+  <Display>DocumentLibraryForm</Display>
+  <Edit>DocumentLibraryForm</Edit>
+  <New>DocumentLibraryForm</New>
+</FormTemplates>
 </file>
 
-<file path=customXml/itemProps2.xml><?xml version="1.0" encoding="utf-8"?>
-<ds:datastoreItem xmlns:ds="http://schemas.openxmlformats.org/officeDocument/2006/customXml" ds:itemID="{8D41AFF9-54E9-4133-9C0A-3728B3B1246D}">
-  <ds:schemaRefs>
-    <ds:schemaRef ds:uri="http://schemas.microsoft.com/sharepoint/v3/contenttype/forms"/>
-  </ds:schemaRefs>
-</ds:datastoreItem>
+<file path=customXml/item3.xml><?xml version="1.0" encoding="utf-8"?>
+<p:properties xmlns:p="http://schemas.microsoft.com/office/2006/metadata/properties" xmlns:xsi="http://www.w3.org/2001/XMLSchema-instance" xmlns:pc="http://schemas.microsoft.com/office/infopath/2007/PartnerControls">
+  <documentManagement/>
+</p:properties>
 </file>
 
-<file path=customXml/itemProps3.xml><?xml version="1.0" encoding="utf-8"?>
+<file path=customXml/item4.xml><?xml version="1.0" encoding="utf-8"?>
+<b:Sources xmlns:b="http://schemas.openxmlformats.org/officeDocument/2006/bibliography" xmlns="http://schemas.openxmlformats.org/officeDocument/2006/bibliography" SelectedStyle="\APASixthEditionOfficeOnline.xsl" StyleName="APA" Version="6"/>
+</file>
+
+<file path=customXml/itemProps1.xml><?xml version="1.0" encoding="utf-8"?>
 <ds:datastoreItem xmlns:ds="http://schemas.openxmlformats.org/officeDocument/2006/customXml" ds:itemID="{C27D835C-03FA-4402-90DC-C03A03034F5B}">
   <ds:schemaRefs>
     <ds:schemaRef ds:uri="http://schemas.microsoft.com/office/2006/metadata/contentType"/>
@@ -1840,4 +1817,29 @@
     <ds:schemaRef ds:uri="http://schemas.microsoft.com/internal/obd"/>
   </ds:schemaRefs>
 </ds:datastoreItem>
+</file>
+
+<file path=customXml/itemProps2.xml><?xml version="1.0" encoding="utf-8"?>
+<ds:datastoreItem xmlns:ds="http://schemas.openxmlformats.org/officeDocument/2006/customXml" ds:itemID="{8D41AFF9-54E9-4133-9C0A-3728B3B1246D}">
+  <ds:schemaRefs>
+    <ds:schemaRef ds:uri="http://schemas.microsoft.com/sharepoint/v3/contenttype/forms"/>
+  </ds:schemaRefs>
+</ds:datastoreItem>
+</file>
+
+<file path=customXml/itemProps3.xml><?xml version="1.0" encoding="utf-8"?>
+<ds:datastoreItem xmlns:ds="http://schemas.openxmlformats.org/officeDocument/2006/customXml" ds:itemID="{2E466FA6-9F10-47D9-BA4E-D0174AD7654D}">
+  <ds:schemaRefs>
+    <ds:schemaRef ds:uri="http://schemas.microsoft.com/office/2006/metadata/properties"/>
+    <ds:schemaRef ds:uri="http://schemas.microsoft.com/office/infopath/2007/PartnerControls"/>
+  </ds:schemaRefs>
+</ds:datastoreItem>
+</file>
+
+<file path=customXml/itemProps4.xml><?xml version="1.0" encoding="utf-8"?>
+<ds:datastoreItem xmlns:ds="http://schemas.openxmlformats.org/officeDocument/2006/customXml" ds:itemID="{9C9C6C4C-B7EA-42A6-8FAB-C8A66299FB4D}">
+  <ds:schemaRefs>
+    <ds:schemaRef ds:uri="http://schemas.openxmlformats.org/officeDocument/2006/bibliography"/>
+  </ds:schemaRefs>
+</ds:datastoreItem>
 </file>
</xml_diff>